<commit_message>
How to Publish: remove mismatched backmatter cover
</commit_message>
<xml_diff>
--- a/How to Publish Your First Kindle Book/How to Publish Your First Kindle Book_REV43_2026-10-13.docx
+++ b/How to Publish Your First Kindle Book/How to Publish Your First Kindle Book_REV43_2026-10-13.docx
@@ -11637,94 +11637,6 @@
           <w:szCs w:val="24"/>
         </w:rPr>
         <w:br w:type="page"/>
-      </w:r>
-    </w:p>
-    <w:p>
-      <w:pPr>
-        <w:pStyle w:val="ListBullet"/>
-        <w:numPr>
-          <w:ilvl w:val="0"/>
-          <w:numId w:val="0"/>
-        </w:numPr>
-        <w:jc w:val="center"/>
-        <w:rPr>
-          <w:i/>
-          <w:iCs/>
-          <w:sz w:val="24"/>
-          <w:szCs w:val="24"/>
-        </w:rPr>
-      </w:pPr>
-      <w:r>
-        <w:rPr>
-          <w:i/>
-          <w:iCs/>
-          <w:noProof/>
-          <w:sz w:val="24"/>
-          <w:szCs w:val="24"/>
-        </w:rPr>
-        <w:lastRenderedPageBreak/>
-        <w:drawing>
-          <wp:anchor distT="0" distB="0" distL="114300" distR="114300" simplePos="0" relativeHeight="251659264" behindDoc="0" locked="0" layoutInCell="1" allowOverlap="1" wp14:anchorId="0A0B2C8C" wp14:editId="729FD643">
-            <wp:simplePos x="0" y="0"/>
-            <wp:positionH relativeFrom="margin">
-              <wp:align>center</wp:align>
-            </wp:positionH>
-            <wp:positionV relativeFrom="page">
-              <wp:align>bottom</wp:align>
-            </wp:positionV>
-            <wp:extent cx="5452110" cy="8439150"/>
-            <wp:effectExtent l="0" t="0" r="0" b="0"/>
-            <wp:wrapTopAndBottom/>
-            <wp:docPr id="1611148847" name="Picture 2"/>
-            <wp:cNvGraphicFramePr>
-              <a:graphicFrameLocks xmlns:a="http://schemas.openxmlformats.org/drawingml/2006/main" noChangeAspect="1"/>
-            </wp:cNvGraphicFramePr>
-            <a:graphic xmlns:a="http://schemas.openxmlformats.org/drawingml/2006/main">
-              <a:graphicData uri="http://schemas.openxmlformats.org/drawingml/2006/picture">
-                <pic:pic xmlns:pic="http://schemas.openxmlformats.org/drawingml/2006/picture">
-                  <pic:nvPicPr>
-                    <pic:cNvPr id="0" name="Picture 2"/>
-                    <pic:cNvPicPr>
-                      <a:picLocks noChangeAspect="1" noChangeArrowheads="1"/>
-                    </pic:cNvPicPr>
-                  </pic:nvPicPr>
-                  <pic:blipFill>
-                    <a:blip r:embed="rId41">
-                      <a:extLst>
-                        <a:ext uri="{28A0092B-C50C-407E-A947-70E740481C1C}">
-                          <a14:useLocalDpi xmlns:a14="http://schemas.microsoft.com/office/drawing/2010/main" val="0"/>
-                        </a:ext>
-                      </a:extLst>
-                    </a:blip>
-                    <a:srcRect/>
-                    <a:stretch>
-                      <a:fillRect/>
-                    </a:stretch>
-                  </pic:blipFill>
-                  <pic:spPr bwMode="auto">
-                    <a:xfrm>
-                      <a:off x="0" y="0"/>
-                      <a:ext cx="5452110" cy="8439150"/>
-                    </a:xfrm>
-                    <a:prstGeom prst="rect">
-                      <a:avLst/>
-                    </a:prstGeom>
-                    <a:noFill/>
-                    <a:ln>
-                      <a:noFill/>
-                    </a:ln>
-                  </pic:spPr>
-                </pic:pic>
-              </a:graphicData>
-            </a:graphic>
-            <wp14:sizeRelH relativeFrom="margin">
-              <wp14:pctWidth>0</wp14:pctWidth>
-            </wp14:sizeRelH>
-            <wp14:sizeRelV relativeFrom="margin">
-              <wp14:pctHeight>0</wp14:pctHeight>
-            </wp14:sizeRelV>
-          </wp:anchor>
-        </w:drawing>
       </w:r>
     </w:p>
     <w:sectPr>

</xml_diff>

<commit_message>
How to Publish: polish REV43 prose and instructions
</commit_message>
<xml_diff>
--- a/How to Publish Your First Kindle Book/How to Publish Your First Kindle Book_REV43_2026-10-13.docx
+++ b/How to Publish Your First Kindle Book/How to Publish Your First Kindle Book_REV43_2026-10-13.docx
@@ -1494,7 +1494,7 @@
     </w:p>
     <w:p>
       <w:r>
-        <w:t xml:space="preserve">A finished manuscript is a beginning. Before a reader can find it, the file must open cleanly, the product page must tell the truth, and the launch must fit the time and money you have. This guide separates platform rules from advice, gives you a route through the decisions, and shows you what you can learn without promising what you cannot control.</w:t>
+        <w:t xml:space="preserve">A finished manuscript is only the first threshold. Before readers can find the book, its file must open cleanly, its product page must tell the truth, and its launch must fit your time and budget. This guide separates platform rules from practical advice, leads you through the decisions, and shows what you can learn without promising what no author can control.</w:t>
       </w:r>
     </w:p>
     <w:p>
@@ -1968,12 +1968,12 @@
     </w:p>
     <w:p>
       <w:r>
-        <w:t>The example book is a cozy mystery: one ferry office, one missing guest, one week, and the woman who keeps the office has to solve it. That is one kind of book. Her sentence for it is: a gentle mystery, a small town, no gore.</w:t>
-      </w:r>
-    </w:p>
-    <w:p>
-      <w:r>
-        <w:t>Write the one sentence you could print under your title. Then write one page for the path: what the reader knows at the start and what they know at the end. If you can retell your book only by listing someone else’s chapters, you copied a table of contents; invent your own.</w:t>
+        <w:t>The example is a cozy mystery set in a ferry office. A guest vanishes, and the woman who runs the office has one week to find him. Its promise is simple: a gentle small-town mystery, without gore.</w:t>
+      </w:r>
+    </w:p>
+    <w:p>
+      <w:r>
+        <w:t>Write one sentence you could print beneath your title, then one page tracing the reader's path: what they know at the start and what they understand by the end. If all you can do is list someone else's chapters, you have a table of contents, not the book's own shape. Find the story or argument that makes yours distinct.</w:t>
       </w:r>
     </w:p>
     <w:p>
@@ -2032,7 +2032,7 @@
     </w:p>
     <w:p>
       <w:r>
-        <w:t>The second sentence matters as much as the first. A wrong-fit reader may return the book or leave a review saying the page promised something else.</w:t>
+        <w:t>The second sentence matters as much as the first. A reader looking for something else may return the book or leave a review saying the product page promised a different experience.</w:t>
       </w:r>
     </w:p>
     <w:p>
@@ -2085,7 +2085,7 @@
     </w:p>
     <w:p>
       <w:r>
-        <w:t>Choose the 70% royalty option when KDP offers it and the book qualifies. The eligibility rules are specific, so use the current KDP price page during setup rather than relying on an old example [3] [4].</w:t>
+        <w:t>Choose the 70% royalty option only when KDP offers it for your eBook and the book meets its current eligibility rules. Check KDP's live pricing pages during setup; an old example may no longer apply [3] [4].</w:t>
       </w:r>
     </w:p>
     <w:p>
@@ -2098,12 +2098,12 @@
     </w:p>
     <w:p>
       <w:r>
-        <w:t>For most paid Kindle eBooks, the 70% option is recommended when eligible. On Amazon.com, the current list-price band is $2.99-$12.99. The book must meet KDP’s eligibility and territory rules; Brazil, Japan, Mexico, and India require KDP Select for the 70% option. Other marketplaces have their own conditions [3] [4].</w:t>
-      </w:r>
-    </w:p>
-    <w:p>
-      <w:r>
-        <w:t>During setup, choose 70% if KDP offers it for your book. If it does not, follow the option shown for that marketplace; do not guess from old online advice.</w:t>
+        <w:t>For most paid Kindle eBooks, the 70% option is preferable when eligible. On Amazon.com, the current list-price band is $2.99-$12.99. The book must also meet KDP's territory and other conditions; in Brazil, Japan, Mexico, and India, the 70% option requires KDP Select. Other marketplaces set their own terms [3] [4].</w:t>
+      </w:r>
+    </w:p>
+    <w:p>
+      <w:r>
+        <w:t>If KDP does not offer that option, use the royalty plan shown for your marketplace. Do not infer eligibility from an old online example.</w:t>
       </w:r>
     </w:p>
     <w:p>
@@ -2116,7 +2116,7 @@
     </w:p>
     <w:p>
       <w:r>
-        <w:t>Choose 70% when KDP says your Kindle eBook qualifies. To give a new book a lower buying hurdle and seek early traction, start near the lower end of the eligible range. Treat this as a sensible starting test, not a sales promise; Chapter 24 covers the launch-price decision.</w:t>
+        <w:t>If your goal is to lower the first-purchase hurdle, start near the low end of the eligible range. Treat that price as a test, not a sales promise; Chapter 24 explains how to assess a launch price.</w:t>
       </w:r>
     </w:p>
     <w:p>
@@ -2239,7 +2239,7 @@
         </w:r>
       </w:hyperlink>
       <w:r>
-        <w:t xml:space="preserve">, not single words such as “book.” Her seven: small town sleuth, amateur detective inn, clean no gore, village puzzle, quiet village detective, gentle puzzle novel, weekend read. She leaves out the word “mystery” because KDP advises against keywords that repeat words already in your categories </w:t>
+        <w:t xml:space="preserve">, not single words such as “book.” Her seven phrases are: small-town sleuth, amateur sleuth at an inn, quiet village detective, gentle puzzle novel, village puzzle, clean read with no gore, weekend read. She leaves out the word “mystery” because KDP advises against repeating category terms in keywords </w:t>
       </w:r>
       <w:hyperlink w:anchor="note_18">
         <w:r>
@@ -2691,7 +2691,7 @@
     </w:p>
     <w:p>
       <w:r>
-        <w:t>A slow book rarely explains itself. Find the earliest uncertain step and test one marketing change at a time. Fix factual errors, broken links, accessibility barriers, privacy problems, and reading defects promptly; a clean test never justifies leaving a known problem in place.</w:t>
+        <w:t>A quiet launch cannot tell you by itself why readers are not buying. Find the earliest uncertain step and test one marketing change at a time. Fix factual errors, broken links, accessibility barriers, privacy problems, and reading defects promptly; a clean test never justifies leaving a known problem in place.</w:t>
       </w:r>
     </w:p>
     <w:p>
@@ -2977,12 +2977,12 @@
     </w:p>
     <w:p>
       <w:r>
-        <w:t>Keep the Word file as your editable source. Export a dated EPUB candidate for KDP and for advance readers; label the review copy clearly and follow the Select exclusivity rules in Chapter 28. Chapter 32 covers delivery.</w:t>
-      </w:r>
-    </w:p>
-    <w:p>
-      <w:r>
-        <w:t>Your first upload has four moves: finish the Word source and separate cover; enter matching title and author details; export a dated EPUB and upload it with the cover in their own fields; preview the conversion; then correct the source, rebuild the EPUB, and preview again. Complete the account and rights questions shown in KDP before submitting.</w:t>
+        <w:t>Create a dated EPUB candidate for KDP and advance readers; label the review copy clearly and follow the Select exclusivity rules in Chapter 28. Chapter 32 covers delivery.</w:t>
+      </w:r>
+    </w:p>
+    <w:p>
+      <w:r>
+        <w:t>Your first upload has four steps. First, finish the Word source and separate cover. Next, enter matching title and author details. Then export a dated EPUB and upload it with the cover in their separate fields. Finally, preview the conversion; if it needs correction, fix the source, rebuild, and preview again. Complete the account and rights questions KDP presents before submitting.</w:t>
       </w:r>
     </w:p>
     <w:p>
@@ -2992,7 +2992,7 @@
     </w:p>
     <w:p>
       <w:r>
-        <w:t>Release gate: the title and author match everywhere; you own or have permission for the content; the contents and chapter navigation work; the text remains readable when the font changes; links work; and the description and cover match the book. If any check fails, fix it before announcing the release.</w:t>
+        <w:t>Before release, confirm that the title and author match everywhere, you have rights to the content, navigation works, text remains readable when the font changes, links work, and the cover and description match the book.</w:t>
       </w:r>
     </w:p>
     <w:p>
@@ -3335,11 +3335,11 @@
         <w:jc w:val="center"/>
       </w:pPr>
       <w:r>
-        <w:t xml:space="preserve">A practical publishing sequence is: choose and write; format; design the cover; complete metadata and the product page; set a price; launch; decide whether advertising fits; track payments; </w:t>
+        <w:t xml:space="preserve">Publishing follows a practical sequence: choose the book, write it, format it, and design a cover. Next, complete the metadata and product page, set the price, and launch. Decide whether advertising fits, track payments, choose between KDP Select and wide distribution, then begin the next book. The chapters below cover each step.</w:t>
       </w:r>
       <w:r>
         <w:lastRenderedPageBreak/>
-        <w:t>choose between KDP Select and wide distribution; then begin the next book. The chapters below cover these steps.</w:t>
+        <w:t/>
       </w:r>
     </w:p>
     <w:p>
@@ -3555,7 +3555,7 @@
     </w:p>
     <w:p>
       <w:r>
-        <w:t xml:space="preserve">Keywords follow the same fork. </w:t>
+        <w:t xml:space="preserve">Keywords work differently across genres. See </w:t>
       </w:r>
       <w:hyperlink w:anchor="ch_23">
         <w:r>
@@ -3567,7 +3567,7 @@
         </w:r>
       </w:hyperlink>
       <w:r>
-        <w:t xml:space="preserve">’s seven-box rule is identical either way, but the phrases that fill it are not: a fiction reader searches on genre, trope, and feel — “cozy mystery,” “slow burn romance,” “clean fantasy no gore” — while a nonfiction reader searches on problem and outcome — “meal prep for beginners,” “SQL for data analysts,” “first apartment budget.” Write your seven for the reader you actually have, not for the example in </w:t>
+        <w:t xml:space="preserve"> for the seven-box rule; search phrases depend on the reader. Fiction readers search by genre, trope, and tone: “cozy mystery,” “slow-burn romance,” or “clean fantasy, no gore.” Nonfiction readers search by problem and outcome: “meal prep for beginners,” “SQL for data analysts,” or “first-apartment budget.” Choose terms for your own reader, not the example in </w:t>
       </w:r>
       <w:hyperlink w:anchor="ch_5">
         <w:r>
@@ -3694,7 +3694,7 @@
       </w:r>
       <w:r>
         <w:lastRenderedPageBreak/>
-        <w:t>its own terms. A nonfiction book needs readers who either have the problem it solves or enough standing in the subject to judge whether the solution actually works; a glowing review from someone who never had the problem is worth less than a flat one from someone who did.</w:t>
+        <w:t>its own terms. A nonfiction book needs readers who have the problem it solves, or reviewers with enough subject knowledge to judge whether the solution works. A glowing review from someone who never had the problem may be less useful than a critical one from someone who did.</w:t>
       </w:r>
     </w:p>
     <w:p>
@@ -3773,7 +3773,7 @@
     </w:p>
     <w:p>
       <w:r>
-        <w:t>“Write the book only you can write” is good advice and a weak business plan on its own. A book that sells sits where two things meet: something you can write well, and something a group of readers is already looking for. Amazon’s own store is a free research tool for finding that meeting point.</w:t>
+        <w:t>“Write the book only you can write” is good advice, but on its own it makes a weak business plan. A book with a market needs two things: something you can write well and something a group of readers is already looking for. Amazon's store can help you investigate that overlap.</w:t>
       </w:r>
     </w:p>
     <w:p>
@@ -3825,7 +3825,7 @@
         <w:pStyle w:val="ListBullet"/>
       </w:pPr>
       <w:r>
-        <w:t>Read the one- and two-star reviews of the current leaders. They tell you what readers wanted and did not get. That gap can become your outline.</w:t>
+        <w:t>Read one- and two-star reviews of the leading books to learn what readers found missing. Treat those comments as questions for your own research, not as a ready-made outline.</w:t>
       </w:r>
     </w:p>
     <w:p>
@@ -3833,7 +3833,7 @@
         <w:rPr>
           <w:b/>
         </w:rPr>
-        <w:t xml:space="preserve">Worked example. A hypothetical beginner’s hobby guide: the top of the list is held by three books six to ten years old; two books published in the last 90 days already have dozens of reviews; four single-book authors sit in the top twenty; and the low-star reviews of all three leaders complain that there is no troubleshooting for humid climates. None of that guarantees a sale. It does give you a shelf with signs of current reader interest and one checkable gap to lead with in your subtitle and description (Chapter 23).</w:t>
+        <w:t xml:space="preserve">Worked example. A hypothetical beginner's hobby guide faces a shelf led by three books published six to ten years ago. Two newer titles, each released within the last 90 days, already have dozens of reviews; four single-book authors appear in the top twenty. Reviews of all three leaders point to one possible gap: troubleshooting for humid climates. None of this guarantees sales. It does give the author a sign of current interest and a specific question to investigate for the subtitle and description (Chapter 23).</w:t>
       </w:r>
     </w:p>
     <w:p>
@@ -3976,7 +3976,7 @@
         <w:pStyle w:val="ListBullet"/>
       </w:pPr>
       <w:r>
-        <w:t>Give the book to one reader who has never seen it and ask where they got confused or bored.</w:t>
+        <w:t>Give the book to someone unfamiliar with it and ask where they felt confused or bored.</w:t>
       </w:r>
     </w:p>
     <w:p>
@@ -4321,7 +4321,7 @@
     </w:p>
     <w:p>
       <w:r>
-        <w:t>A shopper finds a book by searching or by browsing. Keywords serve the first path, categories the second, and the product page turns either kind of visit into a sale. All three are free to set and free to change.</w:t>
+        <w:t>A shopper finds a book by searching or browsing. Keywords help it appear in search; categories help readers browse. The product page gives them the information to decide whether to buy. All three are free to set and change.</w:t>
       </w:r>
     </w:p>
     <w:p>
@@ -4628,7 +4628,7 @@
     </w:p>
     <w:p>
       <w:r>
-        <w:t>Amazon Author Central gives you a free author page with a biography, a photo, and all your books, and is where publishers can add editorial reviews, which are separate from customer reviews. A+ Content adds image-and-text modules lower on the page; check your KDP Marketing page for what is available to your account.</w:t>
+        <w:t>Amazon Author Central provides a free author page with a biography, photo, and book list; eligible publishers can also add editorial reviews there. A+ Content adds image-and-text modules farther down the product page. Check your KDP Marketing page to see what your account can use.</w:t>
       </w:r>
     </w:p>
     <w:p>
@@ -4662,7 +4662,7 @@
     </w:p>
     <w:p>
       <w:r>
-        <w:t>For most paid Kindle eBooks, the 70% option is recommended when eligible. On Amazon.com, the current list-price band is $2.99-$12.99. The book must meet KDP’s eligibility and territory rules; Brazil, Japan, Mexico, and India require KDP Select for the 70% option. Other marketplaces have their own conditions [3] [4].</w:t>
+        <w:t>For most paid Kindle eBooks, the 70% option is preferable when eligible. On Amazon.com, the current list-price band is $2.99-$12.99. The book must also meet KDP's territory and other conditions; in Brazil, Japan, Mexico, and India, the 70% option requires KDP Select. Other marketplaces set their own terms [3] [4].</w:t>
       </w:r>
     </w:p>
     <w:p>
@@ -4715,7 +4715,7 @@
         <w:spacing w:before="240"/>
       </w:pPr>
       <w:r>
-        <w:t>A launch gives interested readers a clear date, a working store link, and a reason to open the sample. Coordinate the announcement and optional advance-reader reminder; readers choose whether to buy or review, and neither outcome has to happen in a prescribed window.</w:t>
+        <w:t>A launch gives interested readers a clear date, a working store link, and a reason to open the sample. Coordinate the announcement and optional advance-reader reminder, but leave readers free to buy or review whenever they choose.</w:t>
       </w:r>
     </w:p>
     <w:p>
@@ -4723,7 +4723,7 @@
         <w:rPr>
           <w:b/>
         </w:rPr>
-        <w:t>Recommendation. Coordinate launch messages around the publication date if that makes them easier to manage and gives interested readers a clear link. A short sales burst may coincide with a ranking change, but the size and cause of any change are not predictable. Do not pay for a promised rank.</w:t>
+        <w:t>Recommendation. Choose a publication-day message if it keeps the timing and links simple. A brief sales rise can coincide with a ranking change, but neither its size nor its cause is predictable. Do not pay for a promised rank.</w:t>
       </w:r>
     </w:p>
     <w:p>
@@ -4740,7 +4740,7 @@
         <w:rPr>
           <w:b/>
         </w:rPr>
-        <w:t>Platform rule [12]. Pre-orders are for new eBooks only. A pre-order created on or after 2 September 2026 can be scheduled up to 18 months ahead, with up to 10 active at once. Submit the final manuscript at least 72 hours before release. The first missed deadline or cancellation receives a one-time account-level courtesy; a second removes pre-order privileges for six months across the catalog. Earlier pre-orders can be subject to different rules. If you lower the price during the pre-order, earlier buyers pay the lower price.</w:t>
+        <w:t>Platform rule [12]. Pre-orders are available for new eBooks only. Created on or after 2 September 2026, a pre-order may be scheduled up to 18 months ahead, with no more than 10 active at once. Submit the final manuscript at least 72 hours before release. The first missed deadline or cancellation receives a one-time account-level courtesy; a second removes pre-order privileges for six months across the catalog. Earlier pre-orders may follow different rules. If you lower the list price before release, earlier buyers pay the lower price.</w:t>
       </w:r>
       <w:hyperlink w:anchor="note_14">
         <w:r>
@@ -5617,7 +5617,7 @@
         <w:rPr>
           <w:b/>
         </w:rPr>
-        <w:t>Plan conservatively: a first book may not cover its costs, and no checklist can create demand. A careful process can reduce avoidable errors and give you better information for the next decision; it cannot guarantee sales or quantify how much it improves your chances. Prioritize sound editing, accurate metadata, optional and honest reviews, controlled spending, and work you can afford to finish.</w:t>
+        <w:t>Plan conservatively: your first book may not cover its costs, and no checklist can create demand. A careful process can reduce avoidable errors and give you better information for the next decision; it cannot guarantee sales or show exactly how much it improves your chances. Prioritize sound editing, accurate metadata, optional and honest reviews, controlled spending, and work you can afford to finish.</w:t>
       </w:r>
     </w:p>
     <w:p>
@@ -5828,7 +5828,7 @@
         <w:t>.</w:t>
       </w:r>
       <w:r>
-        <w:t xml:space="preserve"> Goodreads has no spend minimum and allows ratings before publication. Since its December 2025 update, a reader rating a pre-publication book must confirm they read it (a reader who did not finish may say so), is asked how they got the copy (author or publisher, a giveaway, or another source), and that source is to be shown with the review. A reader who has only shelved a book as Want to Read cannot rate it.</w:t>
+        <w:t xml:space="preserve"> Goodreads has no purchase minimum and allows ratings before publication. Since its December 2025 update, readers rating a pre-publication book must confirm they have read it; readers who did not finish may say so. Goodreads also asks how readers obtained the book and displays that source with the review. A reader who has only marked a book Want to Read cannot rate it.</w:t>
       </w:r>
     </w:p>
     <w:p>
@@ -6294,7 +6294,7 @@
     </w:p>
     <w:p>
       <w:r>
-        <w:t xml:space="preserve">One pattern deserves a name: take a few existing books on a subject, have AI condense and merge them, then run a “similarity audit” to find and remove close parallels with those particular sources until the draft no longer looks derived.</w:t>
+        <w:t xml:space="preserve">One pattern deserves a name: have AI condense and merge several books, then use a “similarity audit” to remove close parallels until the draft looks unrelated to those sources.</w:t>
       </w:r>
     </w:p>
     <w:p>
@@ -6432,7 +6432,7 @@
     </w:p>
     <w:p>
       <w:r>
-        <w:t>Your action. Save the current page, ask the three questions, and correct one inaccurate or confusing element. Fix factual errors and broken links promptly.</w:t>
+        <w:t>Your action. Save the current page and ask the three questions. Fix factual errors and broken links promptly; if readers reveal a mismatch, correct that element and record why.</w:t>
       </w:r>
     </w:p>
     <w:p>
@@ -6471,7 +6471,7 @@
     </w:p>
     <w:p>
       <w:r>
-        <w:t>Put the invitation after the reader has received the main value of the book. Keep it short. Name the link plainly and make it readable aloud: “Get the printable reading log” is more informative than “click here.” If the link is important, include a short, stable URL as text as well, so it remains usable in reading systems that do not handle every link in the same way.</w:t>
+        <w:t>Put the invitation after the reader has received the book's main value. Keep it short. Name the link plainly and make it readable aloud: “Get the printable reading log” is more informative than “click here.” If the link matters, include a short, stable URL as text. That keeps it usable in reading systems that do not handle every link the same way.</w:t>
       </w:r>
     </w:p>
     <w:p>
@@ -7976,7 +7976,7 @@
     </w:p>
     <w:p>
       <w:r>
-        <w:t>Her first preview pass follows the reader’s journey: open at the beginning; navigate to a later chapter from the contents; read a list at a larger font; inspect both diagrams on a phone-sized view; tap the signup link; and confirm that the final chapter and back matter appear in the correct order. She records the exact exported filename and corrects the source before creating a fresh candidate. A good preview is evidence about that file, not about every file she has ever exported.</w:t>
+        <w:t>Her first preview follows the reader's journey. She opens the book and uses the contents to jump to a later chapter. She reads a list at larger type, checks both diagrams on a phone-sized screen, taps the signup link, and confirms that the final chapter and back matter appear in order.</w:t>
       </w:r>
     </w:p>
     <w:p>
@@ -8708,7 +8708,7 @@
     </w:p>
     <w:p>
       <w:r>
-        <w:t>The platform rules can be checked against the dated notes, and the Launch Scorecard can be compared with your own reader response and results. This book promises no sales, reviews, or subscribers.</w:t>
+        <w:t>Use the numbered notes to check platform rules against current sources; use the Launch Scorecard to record what your readers actually do. This book promises no sales, reviews, or subscribers.</w:t>
       </w:r>
     </w:p>
     <w:p>
@@ -8971,7 +8971,7 @@
         </w:rPr>
       </w:pPr>
       <w:r>
-        <w:t>If you go wide (Chapter 28), you can upload the eBook to each retailer directly (for example Apple Books, Kobo, and Barnes &amp; Noble Press) or use a distributor that reaches several eBook retailers and library platforms from one upload. Check each service’s current terms, supported formats, and fees.</w:t>
+        <w:t>If you go wide (Chapter 28), upload to each retailer (Apple Books, Kobo, or Barnes &amp; Noble Press) or use a distributor that reaches multiple eBook stores and library platforms from one account.</w:t>
       </w:r>
     </w:p>
     <w:p>

</xml_diff>